<commit_message>
Complete reproducible house price capstone
</commit_message>
<xml_diff>
--- a/submission/Submission_Dilnura_Hamdamova.docx
+++ b/submission/Submission_Dilnura_Hamdamova.docx
@@ -30,7 +30,7 @@
         <w:t xml:space="preserve">Project Track: </w:t>
       </w:r>
       <w:r>
-        <w:t>Individual Project Track</w:t>
+        <w:t>Field-Based Scenario — Real Estate</w:t>
       </w:r>
     </w:p>
     <w:p>
@@ -65,7 +65,7 @@
     </w:p>
     <w:p>
       <w:r>
-        <w:t>This capstone project develops an end-to-end machine learning regression system for estimating residential property prices in Tashkent. It validates raw apartment attributes, engineers a floor-ratio feature, compares a median baseline with Ridge Regression, Random Forest, and Gradient Boosting using reproducible cross-validation, evaluates the selected model on a protected unseen test split, saves the trained model, and provides a reusable prediction workflow. Performance is reported with MAE, RMSE, R², and MAPE together with error analysis and limitations.</w:t>
+        <w:t>An end-to-end supervised regression project that estimates 2019 Tashkent apartment listing prices in USD. The system audits and de-duplicates 7,421 public listings, compares a median baseline, Log Ridge, Random Forest, and Gradient Boosting with leakage-safe cross-validation, and evaluates the selected Random Forest on a protected test set. The final test result is MAE $10,573, RMSE $23,162, R² 0.745, and MAPE 16.66%. The repository includes the documented dataset, saved preprocessing/model pipeline, error analysis, tests, and a reproducible Colab demo.</w:t>
       </w:r>
     </w:p>
     <w:p>
@@ -78,7 +78,7 @@
     </w:p>
     <w:p>
       <w:r>
-        <w:t>The reproducible demo and all run instructions are included in the GitHub repository above.</w:t>
+        <w:t>Google Colab: https://colab.research.google.com/github/DilnuraHamdamova/tashkent-house-price-predictor/blob/main/demo.ipynb</w:t>
       </w:r>
     </w:p>
     <w:p>
@@ -91,7 +91,7 @@
     </w:p>
     <w:p>
       <w:r>
-        <w:t>The repository is public. Open the repository link, follow the README setup instructions, install requirements.txt, run the training command, and then run the documented prediction example. No password, API key, or special access is required.</w:t>
+        <w:t>The GitHub repository is public and requires no password or API key. Open the Colab link and select Runtime → Run all, or follow the README local setup commands. The committed model and dataset make the main demo reproducible.</w:t>
       </w:r>
     </w:p>
     <w:p>
@@ -104,7 +104,7 @@
     </w:p>
     <w:p>
       <w:r>
-        <w:t>AI coding assistance was used for repository cleanup, code review, testing support, and documentation. The student remains responsible for understanding, verifying, and explaining all submitted work.</w:t>
+        <w:t>AI coding assistance was used for scaffolding, review, testing support, and documentation. The student remains responsible for verifying, understanding, and explaining all submitted work.</w:t>
       </w:r>
     </w:p>
     <w:sectPr>

</xml_diff>

<commit_message>
Add Individual Track defense evidence pack
</commit_message>
<xml_diff>
--- a/submission/Submission_Dilnura_Hamdamova.docx
+++ b/submission/Submission_Dilnura_Hamdamova.docx
@@ -30,7 +30,7 @@
         <w:t xml:space="preserve">Project Track: </w:t>
       </w:r>
       <w:r>
-        <w:t>Field-Based Scenario — Real Estate</w:t>
+        <w:t>Individual Project Track</w:t>
       </w:r>
     </w:p>
     <w:p>
@@ -91,7 +91,7 @@
     </w:p>
     <w:p>
       <w:r>
-        <w:t>The GitHub repository is public and requires no password or API key. Open the Colab link and select Runtime → Run all, or follow the README local setup commands. The committed model and dataset make the main demo reproducible.</w:t>
+        <w:t>The repository is public and requires no password or API key. Open the Colab link and select Runtime → Run all, or follow the README local setup commands. The committed model and dataset make the main demo reproducible.</w:t>
       </w:r>
     </w:p>
     <w:p>

</xml_diff>

<commit_message>
Rebuild predictor with current 2026 apartment data
</commit_message>
<xml_diff>
--- a/submission/Submission_Dilnura_Hamdamova.docx
+++ b/submission/Submission_Dilnura_Hamdamova.docx
@@ -5,111 +5,538 @@
     <w:p>
       <w:pPr>
         <w:pStyle w:val="Title"/>
-        <w:jc w:val="center"/>
       </w:pPr>
       <w:r>
-        <w:t>CAPSTONE PROJECT SUBMISSION</w:t>
+        <w:t>Individual Project Brief — 2026 revision</w:t>
       </w:r>
     </w:p>
-    <w:p>
-      <w:r>
-        <w:rPr>
-          <w:b/>
-        </w:rPr>
-        <w:t xml:space="preserve">Full Name: </w:t>
-      </w:r>
-      <w:r>
-        <w:t>Dilnura Hamdamova</w:t>
-      </w:r>
-    </w:p>
-    <w:p>
-      <w:r>
-        <w:rPr>
-          <w:b/>
-        </w:rPr>
-        <w:t xml:space="preserve">Project Track: </w:t>
-      </w:r>
-      <w:r>
-        <w:t>Individual Project Track</w:t>
-      </w:r>
-    </w:p>
-    <w:p>
-      <w:r>
-        <w:rPr>
-          <w:b/>
-        </w:rPr>
-        <w:t xml:space="preserve">Project Title: </w:t>
-      </w:r>
-      <w:r>
-        <w:t>Tashkent House Price Predictor</w:t>
-      </w:r>
-    </w:p>
-    <w:p>
-      <w:r>
-        <w:rPr>
-          <w:b/>
-        </w:rPr>
-        <w:t xml:space="preserve">Repository URL: </w:t>
-      </w:r>
-      <w:r>
-        <w:t>https://github.com/DilnuraHamdamova/tashkent-house-price-predictor</w:t>
-      </w:r>
-    </w:p>
+    <w:p/>
     <w:p>
       <w:pPr>
         <w:pStyle w:val="Heading1"/>
       </w:pPr>
       <w:r>
-        <w:t>Short Project Description</w:t>
+        <w:t>Project information</w:t>
+      </w:r>
+    </w:p>
+    <w:p/>
+    <w:p>
+      <w:pPr>
+        <w:pStyle w:val="ListBullet"/>
+      </w:pPr>
+      <w:r>
+        <w:t>Student: Dilnura Hamdamova</w:t>
       </w:r>
     </w:p>
     <w:p>
+      <w:pPr>
+        <w:pStyle w:val="ListBullet"/>
+      </w:pPr>
       <w:r>
-        <w:t>An end-to-end supervised regression project that estimates 2019 Tashkent apartment listing prices in USD. The system audits and de-duplicates 7,421 public listings, compares a median baseline, Log Ridge, Random Forest, and Gradient Boosting with leakage-safe cross-validation, and evaluates the selected Random Forest on a protected test set. The final test result is MAE $10,573, RMSE $23,162, R² 0.745, and MAPE 16.66%. The repository includes the documented dataset, saved preprocessing/model pipeline, error analysis, tests, and a reproducible Colab demo.</w:t>
+        <w:t>Track: Individual Project Track</w:t>
       </w:r>
     </w:p>
+    <w:p>
+      <w:pPr>
+        <w:pStyle w:val="ListBullet"/>
+      </w:pPr>
+      <w:r>
+        <w:t>Title: Tashkent Apartment Listing Price Predictor</w:t>
+      </w:r>
+    </w:p>
+    <w:p>
+      <w:pPr>
+        <w:pStyle w:val="ListBullet"/>
+      </w:pPr>
+      <w:r>
+        <w:t>Repository: https://github.com/DilnuraHamdamova/tashkent-house-price-predictor</w:t>
+      </w:r>
+    </w:p>
+    <w:p>
+      <w:pPr>
+        <w:pStyle w:val="ListBullet"/>
+      </w:pPr>
+      <w:r>
+        <w:t>ML task: supervised tabular regression</w:t>
+      </w:r>
+    </w:p>
+    <w:p>
+      <w:pPr>
+        <w:pStyle w:val="ListBullet"/>
+      </w:pPr>
+      <w:r>
+        <w:t>Primary users: buyers, sellers, agents, and analysts comparing current advertisements</w:t>
+      </w:r>
+    </w:p>
+    <w:p/>
     <w:p>
       <w:pPr>
         <w:pStyle w:val="Heading1"/>
       </w:pPr>
       <w:r>
-        <w:t>Demo / Application Link</w:t>
+        <w:t>Problem</w:t>
+      </w:r>
+    </w:p>
+    <w:p/>
+    <w:p>
+      <w:r>
+        <w:t>The project estimates an August 2026 Tashkent apartment's advertised asking price from district,</w:t>
       </w:r>
     </w:p>
     <w:p>
       <w:r>
-        <w:t>Google Colab: https://colab.research.google.com/github/DilnuraHamdamova/tashkent-house-price-predictor/blob/main/demo.ipynb</w:t>
+        <w:t>size, rooms, apartment floor, building floors, and new-build/resale status. The output supports</w:t>
       </w:r>
     </w:p>
+    <w:p>
+      <w:r>
+        <w:t>comparison and exploration only. It is not a verified completed sale price, legal appraisal,</w:t>
+      </w:r>
+    </w:p>
+    <w:p>
+      <w:r>
+        <w:t>loan/tax decision, or guaranteed price.</w:t>
+      </w:r>
+    </w:p>
+    <w:p/>
     <w:p>
       <w:pPr>
         <w:pStyle w:val="Heading1"/>
       </w:pPr>
       <w:r>
-        <w:t>Access Instructions</w:t>
+        <w:t>Data</w:t>
+      </w:r>
+    </w:p>
+    <w:p/>
+    <w:p>
+      <w:r>
+        <w:t>A privacy-minimized snapshot of public HATA Tashkent apartment-sale catalog pages was collected</w:t>
       </w:r>
     </w:p>
     <w:p>
       <w:r>
-        <w:t>The repository is public and requires no password or API key. Open the Colab link and select Runtime → Run all, or follow the README local setup commands. The committed model and dataset make the main demo reproducible.</w:t>
+        <w:t>on 22 August 2026. Listing dates range from 4–21 August 2026. The collector excludes identity,</w:t>
       </w:r>
     </w:p>
+    <w:p>
+      <w:r>
+        <w:t>contact details, descriptions, and images. The target listing_price_usd is the advertiser's</w:t>
+      </w:r>
+    </w:p>
+    <w:p>
+      <w:r>
+        <w:t>asking price, not a transaction label.</w:t>
+      </w:r>
+    </w:p>
+    <w:p/>
+    <w:p>
+      <w:r>
+        <w:t>From 4,867 parsed complete-feature listings, fixed validity checks remove 257 obvious category,</w:t>
+      </w:r>
+    </w:p>
+    <w:p>
+      <w:r>
+        <w:t>currency, or unit errors. Removing 396 exact feature + target duplicates leaves 4,214 modeling</w:t>
+      </w:r>
+    </w:p>
+    <w:p>
+      <w:r>
+        <w:t>rows in 3,840 feature fingerprints. Source use and limitations are documented in</w:t>
+      </w:r>
+    </w:p>
+    <w:p>
+      <w:r>
+        <w:t>data/README.md; written redistribution permission is a recommended external confirmation.</w:t>
+      </w:r>
+    </w:p>
+    <w:p/>
     <w:p>
       <w:pPr>
         <w:pStyle w:val="Heading1"/>
       </w:pPr>
       <w:r>
-        <w:t>Academic Integrity / AI Assistance</w:t>
+        <w:t>Success criteria</w:t>
+      </w:r>
+    </w:p>
+    <w:p/>
+    <w:p>
+      <w:pPr>
+        <w:pStyle w:val="ListBullet"/>
+      </w:pPr>
+      <w:r>
+        <w:t>Primary metric: MAE in USD.</w:t>
+      </w:r>
+    </w:p>
+    <w:p>
+      <w:pPr>
+        <w:pStyle w:val="ListBullet"/>
+      </w:pPr>
+      <w:r>
+        <w:t>Supporting metrics: RMSE, R², and MAPE.</w:t>
+      </w:r>
+    </w:p>
+    <w:p>
+      <w:pPr>
+        <w:pStyle w:val="ListBullet"/>
+      </w:pPr>
+      <w:r>
+        <w:t>Beat median-baseline protected-test MAE by at least 30%.</w:t>
+      </w:r>
+    </w:p>
+    <w:p>
+      <w:pPr>
+        <w:pStyle w:val="ListBullet"/>
+      </w:pPr>
+      <w:r>
+        <w:t>Reach protected-test R² ≥ 0.60.</w:t>
+      </w:r>
+    </w:p>
+    <w:p>
+      <w:pPr>
+        <w:pStyle w:val="ListBullet"/>
+      </w:pPr>
+      <w:r>
+        <w:t>Keep protected-test MAPE ≤ 25%.</w:t>
+      </w:r>
+    </w:p>
+    <w:p>
+      <w:pPr>
+        <w:pStyle w:val="ListBullet"/>
+      </w:pPr>
+      <w:r>
+        <w:t>Accept a raw example through the saved preprocessing/model pipeline.</w:t>
+      </w:r>
+    </w:p>
+    <w:p/>
+    <w:p>
+      <w:pPr>
+        <w:pStyle w:val="Heading1"/>
+      </w:pPr>
+      <w:r>
+        <w:t>Method</w:t>
+      </w:r>
+    </w:p>
+    <w:p/>
+    <w:p>
+      <w:r>
+        <w:t>Identical district + rooms + size + apartment floor + building floors + building type</w:t>
       </w:r>
     </w:p>
     <w:p>
       <w:r>
-        <w:t>AI coding assistance was used for scaffolding, review, testing support, and documentation. The student remains responsible for verifying, understanding, and explaining all submitted work.</w:t>
+        <w:t>fingerprints remain in one split. Feature groups are split approximately 80/20 at district-</w:t>
+      </w:r>
+    </w:p>
+    <w:p>
+      <w:r>
+        <w:t>stratified group level. Five-fold StratifiedGroupKFold on development data compares:</w:t>
+      </w:r>
+    </w:p>
+    <w:p/>
+    <w:p>
+      <w:pPr>
+        <w:pStyle w:val="ListNumber"/>
+      </w:pPr>
+      <w:r>
+        <w:t>Median Dummy Regressor</w:t>
+      </w:r>
+    </w:p>
+    <w:p>
+      <w:pPr>
+        <w:pStyle w:val="ListNumber"/>
+      </w:pPr>
+      <w:r>
+        <w:t>Log-transformed Ridge Regression</w:t>
+      </w:r>
+    </w:p>
+    <w:p>
+      <w:pPr>
+        <w:pStyle w:val="ListNumber"/>
+      </w:pPr>
+      <w:r>
+        <w:t>Random Forest Regressor</w:t>
+      </w:r>
+    </w:p>
+    <w:p>
+      <w:pPr>
+        <w:pStyle w:val="ListNumber"/>
+      </w:pPr>
+      <w:r>
+        <w:t>Gradient Boosting Regressor</w:t>
+      </w:r>
+    </w:p>
+    <w:p/>
+    <w:p>
+      <w:r>
+        <w:t>Encoding/scaling remains inside each pipeline. Selection uses development CV MAE only. The chosen</w:t>
+      </w:r>
+    </w:p>
+    <w:p>
+      <w:r>
+        <w:t>model is evaluated once on protected groups, then refitted on all cleaned rows for inference.</w:t>
+      </w:r>
+    </w:p>
+    <w:p/>
+    <w:p>
+      <w:pPr>
+        <w:pStyle w:val="Heading1"/>
+      </w:pPr>
+      <w:r>
+        <w:t>Results</w:t>
+      </w:r>
+    </w:p>
+    <w:p/>
+    <w:p>
+      <w:r>
+        <w:t>Random Forest has the best CV MAE at $31,298 ± $3,252. On 835 protected rows from 768 unseen</w:t>
+      </w:r>
+    </w:p>
+    <w:p>
+      <w:r>
+        <w:t>feature groups it achieves:</w:t>
+      </w:r>
+    </w:p>
+    <w:p/>
+    <w:p>
+      <w:pPr>
+        <w:pStyle w:val="ListBullet"/>
+      </w:pPr>
+      <w:r>
+        <w:t>MAE: $27,195</w:t>
+      </w:r>
+    </w:p>
+    <w:p>
+      <w:pPr>
+        <w:pStyle w:val="ListBullet"/>
+      </w:pPr>
+      <w:r>
+        <w:t>RMSE: $58,887</w:t>
+      </w:r>
+    </w:p>
+    <w:p>
+      <w:pPr>
+        <w:pStyle w:val="ListBullet"/>
+      </w:pPr>
+      <w:r>
+        <w:t>R²: 0.681</w:t>
+      </w:r>
+    </w:p>
+    <w:p>
+      <w:pPr>
+        <w:pStyle w:val="ListBullet"/>
+      </w:pPr>
+      <w:r>
+        <w:t>MAPE: 24.58%</w:t>
+      </w:r>
+    </w:p>
+    <w:p/>
+    <w:p>
+      <w:r>
+        <w:t>Median-baseline test MAE is $50,900, so Random Forest improves MAE by 46.6% and meets all stated</w:t>
+      </w:r>
+    </w:p>
+    <w:p>
+      <w:r>
+        <w:t>thresholds. The largest failure is a $1,000,000 Shayhontohur listing predicted near $234,461.</w:t>
+      </w:r>
+    </w:p>
+    <w:p>
+      <w:r>
+        <w:t>Mirobod and Shayhontohur have high slice MAE, and some district slice R² values are negative.</w:t>
+      </w:r>
+    </w:p>
+    <w:p/>
+    <w:p>
+      <w:pPr>
+        <w:pStyle w:val="Heading1"/>
+      </w:pPr>
+      <w:r>
+        <w:t>Delivered system</w:t>
+      </w:r>
+    </w:p>
+    <w:p/>
+    <w:p>
+      <w:pPr>
+        <w:pStyle w:val="ListBullet"/>
+      </w:pPr>
+      <w:r>
+        <w:t>Reproducible current-listing collector and committed snapshot</w:t>
+      </w:r>
+    </w:p>
+    <w:p>
+      <w:pPr>
+        <w:pStyle w:val="ListBullet"/>
+      </w:pPr>
+      <w:r>
+        <w:t>Data validation, deduplication, fingerprint grouping, and feature engineering</w:t>
+      </w:r>
+    </w:p>
+    <w:p>
+      <w:pPr>
+        <w:pStyle w:val="ListBullet"/>
+      </w:pPr>
+      <w:r>
+        <w:t>Baseline plus three trained candidate models</w:t>
+      </w:r>
+    </w:p>
+    <w:p>
+      <w:pPr>
+        <w:pStyle w:val="ListBullet"/>
+      </w:pPr>
+      <w:r>
+        <w:t>Group-safe CV and protected unseen-test evaluation</w:t>
+      </w:r>
+    </w:p>
+    <w:p>
+      <w:pPr>
+        <w:pStyle w:val="ListBullet"/>
+      </w:pPr>
+      <w:r>
+        <w:t>Saved preprocessing/model pipeline and structured metrics</w:t>
+      </w:r>
+    </w:p>
+    <w:p>
+      <w:pPr>
+        <w:pStyle w:val="ListBullet"/>
+      </w:pPr>
+      <w:r>
+        <w:t>CLI prediction with validation and range/unseen-district warnings</w:t>
+      </w:r>
+    </w:p>
+    <w:p>
+      <w:pPr>
+        <w:pStyle w:val="ListBullet"/>
+      </w:pPr>
+      <w:r>
+        <w:t>Focused Colab demo, development notebooks, tests, and CI configuration</w:t>
+      </w:r>
+    </w:p>
+    <w:p>
+      <w:pPr>
+        <w:pStyle w:val="ListBullet"/>
+      </w:pPr>
+      <w:r>
+        <w:t>Error analysis, district slices, responsible-use documentation, deck, pitch, matrix, and Q&amp;A</w:t>
+      </w:r>
+    </w:p>
+    <w:p/>
+    <w:p>
+      <w:pPr>
+        <w:pStyle w:val="Heading1"/>
+      </w:pPr>
+      <w:r>
+        <w:t>Responsible AI and limitations</w:t>
+      </w:r>
+    </w:p>
+    <w:p/>
+    <w:p>
+      <w:r>
+        <w:t>The model is a dated asking-price reference. Advertiser data can be stale, inaccurate,</w:t>
+      </w:r>
+    </w:p>
+    <w:p>
+      <w:r>
+        <w:t>misclassified, or duplicated. Exact building/location, condition, renovation, construction year,</w:t>
+      </w:r>
+    </w:p>
+    <w:p>
+      <w:r>
+        <w:t>legal status, and amenities are absent. Yangihayot is not represented. Geographic market patterns</w:t>
+      </w:r>
+    </w:p>
+    <w:p>
+      <w:r>
+        <w:t>may reproduce inequality, and district performance is unequal. Human review and recent comparable</w:t>
+      </w:r>
+    </w:p>
+    <w:p>
+      <w:r>
+        <w:t>listings are required; the model is prohibited for lending, taxation, legal appraisal, or other</w:t>
+      </w:r>
+    </w:p>
+    <w:p>
+      <w:r>
+        <w:t>high-stakes automated decisions.</w:t>
+      </w:r>
+    </w:p>
+    <w:p/>
+    <w:p>
+      <w:r>
+        <w:t>The strongest improvement is verified transaction data with richer property features and a later</w:t>
+      </w:r>
+    </w:p>
+    <w:p>
+      <w:r>
+        <w:t>time-based holdout. Every future data refresh requires retraining and new reported metrics.</w:t>
+      </w:r>
+    </w:p>
+    <w:p/>
+    <w:p>
+      <w:pPr>
+        <w:pStyle w:val="Heading1"/>
+      </w:pPr>
+      <w:r>
+        <w:t>Reproduction</w:t>
+      </w:r>
+    </w:p>
+    <w:p/>
+    <w:p>
+      <w:pPr>
+        <w:pStyle w:val="NoSpacing"/>
+      </w:pPr>
+      <w:r>
+        <w:rPr>
+          <w:rFonts w:ascii="Courier New" w:hAnsi="Courier New"/>
+          <w:sz w:val="18"/>
+        </w:rPr>
+        <w:t>python -m pip install -r requirements.txt</w:t>
+      </w:r>
+    </w:p>
+    <w:p>
+      <w:pPr>
+        <w:pStyle w:val="NoSpacing"/>
+      </w:pPr>
+      <w:r>
+        <w:rPr>
+          <w:rFonts w:ascii="Courier New" w:hAnsi="Courier New"/>
+          <w:sz w:val="18"/>
+        </w:rPr>
+        <w:t>python -m src.train</w:t>
+      </w:r>
+    </w:p>
+    <w:p>
+      <w:pPr>
+        <w:pStyle w:val="NoSpacing"/>
+      </w:pPr>
+      <w:r>
+        <w:rPr>
+          <w:rFonts w:ascii="Courier New" w:hAnsi="Courier New"/>
+          <w:sz w:val="18"/>
+        </w:rPr>
+        <w:t>python -m src.predict --district Chilonzor --size 70 --rooms 3 \</w:t>
+      </w:r>
+    </w:p>
+    <w:p>
+      <w:pPr>
+        <w:pStyle w:val="NoSpacing"/>
+      </w:pPr>
+      <w:r>
+        <w:rPr>
+          <w:rFonts w:ascii="Courier New" w:hAnsi="Courier New"/>
+          <w:sz w:val="18"/>
+        </w:rPr>
+        <w:t xml:space="preserve">  --level 3 --max-levels 5</w:t>
+      </w:r>
+    </w:p>
+    <w:p/>
+    <w:p>
+      <w:r>
+        <w:t>The checked resale example returns approximately $97,098 USD.</w:t>
       </w:r>
     </w:p>
     <w:sectPr>
       <w:pgSz w:w="12240" w:h="15840"/>
-      <w:pgMar w:top="936" w:right="1800" w:bottom="936" w:left="1800" w:header="720" w:footer="720" w:gutter="0"/>
+      <w:pgMar w:top="1008" w:right="1152" w:bottom="1008" w:left="1152" w:header="720" w:footer="720" w:gutter="0"/>
       <w:cols w:space="720"/>
       <w:docGrid w:linePitch="360"/>
     </w:sectPr>
@@ -481,8 +908,8 @@
     <w:qFormat/>
     <w:rsid w:val="00FC693F"/>
     <w:rPr>
-      <w:rFonts w:ascii="Arial" w:hAnsi="Arial"/>
-      <w:sz w:val="22"/>
+      <w:rFonts w:ascii="Aptos" w:hAnsi="Aptos"/>
+      <w:sz w:val="21"/>
     </w:rPr>
   </w:style>
   <w:style w:type="paragraph" w:styleId="Header">

</xml_diff>